<commit_message>
docs: add verified YouTube presentation video URLs to README and final report
</commit_message>
<xml_diff>
--- a/documentations/MarketSense_Final_Group_Project_Report.docx
+++ b/documentations/MarketSense_Final_Group_Project_Report.docx
@@ -108,7 +108,7 @@
       <w:tr>
         <w:tc>
           <w:tcPr>
-            <w:tcW w:type="dxa" w:w="3168"/>
+            <w:tcW w:type="dxa" w:w="3456"/>
             <w:shd w:fill="FFFFFF"/>
             <w:tcMar>
               <w:top w:w="80" w:type="dxa"/>
@@ -132,7 +132,7 @@
         </w:tc>
         <w:tc>
           <w:tcPr>
-            <w:tcW w:type="dxa" w:w="6192"/>
+            <w:tcW w:type="dxa" w:w="5904"/>
             <w:shd w:fill="FFFFFF"/>
             <w:tcMar>
               <w:top w:w="80" w:type="dxa"/>
@@ -157,7 +157,7 @@
       <w:tr>
         <w:tc>
           <w:tcPr>
-            <w:tcW w:type="dxa" w:w="3168"/>
+            <w:tcW w:type="dxa" w:w="3456"/>
             <w:shd w:fill="F4F6F9"/>
             <w:tcMar>
               <w:top w:w="80" w:type="dxa"/>
@@ -181,7 +181,7 @@
         </w:tc>
         <w:tc>
           <w:tcPr>
-            <w:tcW w:type="dxa" w:w="6192"/>
+            <w:tcW w:type="dxa" w:w="5904"/>
             <w:shd w:fill="F4F6F9"/>
             <w:tcMar>
               <w:top w:w="80" w:type="dxa"/>
@@ -206,7 +206,7 @@
       <w:tr>
         <w:tc>
           <w:tcPr>
-            <w:tcW w:type="dxa" w:w="3168"/>
+            <w:tcW w:type="dxa" w:w="3456"/>
             <w:shd w:fill="FFFFFF"/>
             <w:tcMar>
               <w:top w:w="80" w:type="dxa"/>
@@ -230,7 +230,7 @@
         </w:tc>
         <w:tc>
           <w:tcPr>
-            <w:tcW w:type="dxa" w:w="6192"/>
+            <w:tcW w:type="dxa" w:w="5904"/>
             <w:shd w:fill="FFFFFF"/>
             <w:tcMar>
               <w:top w:w="80" w:type="dxa"/>
@@ -255,7 +255,7 @@
       <w:tr>
         <w:tc>
           <w:tcPr>
-            <w:tcW w:type="dxa" w:w="3168"/>
+            <w:tcW w:type="dxa" w:w="3456"/>
             <w:shd w:fill="F4F6F9"/>
             <w:tcMar>
               <w:top w:w="80" w:type="dxa"/>
@@ -279,7 +279,7 @@
         </w:tc>
         <w:tc>
           <w:tcPr>
-            <w:tcW w:type="dxa" w:w="6192"/>
+            <w:tcW w:type="dxa" w:w="5904"/>
             <w:shd w:fill="F4F6F9"/>
             <w:tcMar>
               <w:top w:w="80" w:type="dxa"/>
@@ -304,7 +304,7 @@
       <w:tr>
         <w:tc>
           <w:tcPr>
-            <w:tcW w:type="dxa" w:w="3168"/>
+            <w:tcW w:type="dxa" w:w="3456"/>
             <w:shd w:fill="FFFFFF"/>
             <w:tcMar>
               <w:top w:w="80" w:type="dxa"/>
@@ -328,7 +328,7 @@
         </w:tc>
         <w:tc>
           <w:tcPr>
-            <w:tcW w:type="dxa" w:w="6192"/>
+            <w:tcW w:type="dxa" w:w="5904"/>
             <w:shd w:fill="FFFFFF"/>
             <w:tcMar>
               <w:top w:w="80" w:type="dxa"/>
@@ -353,8 +353,155 @@
       <w:tr>
         <w:tc>
           <w:tcPr>
-            <w:tcW w:type="dxa" w:w="3168"/>
+            <w:tcW w:type="dxa" w:w="3456"/>
             <w:shd w:fill="F4F6F9"/>
+            <w:tcMar>
+              <w:top w:w="80" w:type="dxa"/>
+              <w:bottom w:w="80" w:type="dxa"/>
+              <w:left w:w="140" w:type="dxa"/>
+              <w:right w:w="140" w:type="dxa"/>
+            </w:tcMar>
+            <w:vAlign w:val="center"/>
+          </w:tcPr>
+          <w:p>
+            <w:r>
+              <w:rPr>
+                <w:rFonts w:ascii="Calibri" w:hAnsi="Calibri"/>
+                <w:b/>
+                <w:color w:val="1B365D"/>
+                <w:sz w:val="18"/>
+              </w:rPr>
+              <w:t>Live Streamlit Web App:</w:t>
+            </w:r>
+          </w:p>
+        </w:tc>
+        <w:tc>
+          <w:tcPr>
+            <w:tcW w:type="dxa" w:w="5904"/>
+            <w:shd w:fill="F4F6F9"/>
+            <w:tcMar>
+              <w:top w:w="80" w:type="dxa"/>
+              <w:bottom w:w="80" w:type="dxa"/>
+              <w:left w:w="140" w:type="dxa"/>
+              <w:right w:w="140" w:type="dxa"/>
+            </w:tcMar>
+            <w:vAlign w:val="center"/>
+          </w:tcPr>
+          <w:p>
+            <w:r>
+              <w:rPr>
+                <w:rFonts w:ascii="Calibri" w:hAnsi="Calibri"/>
+                <w:color w:val="222222"/>
+                <w:sz w:val="18"/>
+              </w:rPr>
+              <w:t>https://marketsense-ai-nus.streamlit.app/</w:t>
+            </w:r>
+          </w:p>
+        </w:tc>
+      </w:tr>
+      <w:tr>
+        <w:tc>
+          <w:tcPr>
+            <w:tcW w:type="dxa" w:w="3456"/>
+            <w:shd w:fill="FFFFFF"/>
+            <w:tcMar>
+              <w:top w:w="80" w:type="dxa"/>
+              <w:bottom w:w="80" w:type="dxa"/>
+              <w:left w:w="140" w:type="dxa"/>
+              <w:right w:w="140" w:type="dxa"/>
+            </w:tcMar>
+            <w:vAlign w:val="center"/>
+          </w:tcPr>
+          <w:p>
+            <w:r>
+              <w:rPr>
+                <w:rFonts w:ascii="Calibri" w:hAnsi="Calibri"/>
+                <w:b/>
+                <w:color w:val="1B365D"/>
+                <w:sz w:val="18"/>
+              </w:rPr>
+              <w:t>Video 1 (Promotional Pitch):</w:t>
+            </w:r>
+          </w:p>
+        </w:tc>
+        <w:tc>
+          <w:tcPr>
+            <w:tcW w:type="dxa" w:w="5904"/>
+            <w:shd w:fill="FFFFFF"/>
+            <w:tcMar>
+              <w:top w:w="80" w:type="dxa"/>
+              <w:bottom w:w="80" w:type="dxa"/>
+              <w:left w:w="140" w:type="dxa"/>
+              <w:right w:w="140" w:type="dxa"/>
+            </w:tcMar>
+            <w:vAlign w:val="center"/>
+          </w:tcPr>
+          <w:p>
+            <w:r>
+              <w:rPr>
+                <w:rFonts w:ascii="Calibri" w:hAnsi="Calibri"/>
+                <w:color w:val="222222"/>
+                <w:sz w:val="18"/>
+              </w:rPr>
+              <w:t>https://youtu.be/Oq-QEI3UvJw</w:t>
+            </w:r>
+          </w:p>
+        </w:tc>
+      </w:tr>
+      <w:tr>
+        <w:tc>
+          <w:tcPr>
+            <w:tcW w:type="dxa" w:w="3456"/>
+            <w:shd w:fill="F4F6F9"/>
+            <w:tcMar>
+              <w:top w:w="80" w:type="dxa"/>
+              <w:bottom w:w="80" w:type="dxa"/>
+              <w:left w:w="140" w:type="dxa"/>
+              <w:right w:w="140" w:type="dxa"/>
+            </w:tcMar>
+            <w:vAlign w:val="center"/>
+          </w:tcPr>
+          <w:p>
+            <w:r>
+              <w:rPr>
+                <w:rFonts w:ascii="Calibri" w:hAnsi="Calibri"/>
+                <w:b/>
+                <w:color w:val="1B365D"/>
+                <w:sz w:val="18"/>
+              </w:rPr>
+              <w:t>Video 2 (Technical System Design):</w:t>
+            </w:r>
+          </w:p>
+        </w:tc>
+        <w:tc>
+          <w:tcPr>
+            <w:tcW w:type="dxa" w:w="5904"/>
+            <w:shd w:fill="F4F6F9"/>
+            <w:tcMar>
+              <w:top w:w="80" w:type="dxa"/>
+              <w:bottom w:w="80" w:type="dxa"/>
+              <w:left w:w="140" w:type="dxa"/>
+              <w:right w:w="140" w:type="dxa"/>
+            </w:tcMar>
+            <w:vAlign w:val="center"/>
+          </w:tcPr>
+          <w:p>
+            <w:r>
+              <w:rPr>
+                <w:rFonts w:ascii="Calibri" w:hAnsi="Calibri"/>
+                <w:color w:val="222222"/>
+                <w:sz w:val="18"/>
+              </w:rPr>
+              <w:t>https://youtu.be/l_06wWVMz8U</w:t>
+            </w:r>
+          </w:p>
+        </w:tc>
+      </w:tr>
+      <w:tr>
+        <w:tc>
+          <w:tcPr>
+            <w:tcW w:type="dxa" w:w="3456"/>
+            <w:shd w:fill="FFFFFF"/>
             <w:tcMar>
               <w:top w:w="80" w:type="dxa"/>
               <w:bottom w:w="80" w:type="dxa"/>
@@ -377,8 +524,8 @@
         </w:tc>
         <w:tc>
           <w:tcPr>
-            <w:tcW w:type="dxa" w:w="6192"/>
-            <w:shd w:fill="F4F6F9"/>
+            <w:tcW w:type="dxa" w:w="5904"/>
+            <w:shd w:fill="FFFFFF"/>
             <w:tcMar>
               <w:top w:w="80" w:type="dxa"/>
               <w:bottom w:w="80" w:type="dxa"/>

</xml_diff>